<commit_message>
docs: embed rendered architecture diagrams as images in Design_Document.docx
- Render all 11 Mermaid diagrams to PNG via Kroki
- Converter now embeds each PNG (scaled to fit page, bounded W/H) in place
  of the code block; Design_Document.docx now contains 11 inline images
- Add diagram sources (docs/diagrams/src/*.mmd), rendered PNGs, and
  docs/_tools/extract_mermaid.py

Co-Authored-By: Claude Opus 4.8 (1M context) <noreply@anthropic.com>
</commit_message>
<xml_diff>
--- a/docs/Design_Document.docx
+++ b/docs/Design_Document.docx
@@ -1260,55 +1260,46 @@
           <w:color w:val="6B7685"/>
           <w:sz w:val="18"/>
         </w:rPr>
-        <w:t>Figure — architecture diagram (Mermaid source; renders graphically on GitHub):</w:t>
+        <w:t>Figure — architecture diagram:</w:t>
       </w:r>
     </w:p>
     <w:p>
       <w:pPr>
-        <w:shd w:val="clear" w:fill="F2F4F7"/>
+        <w:jc w:val="center"/>
       </w:pPr>
       <w:r>
-        <w:rPr>
-          <w:rFonts w:ascii="Consolas" w:hAnsi="Consolas"/>
-          <w:color w:val="242B33"/>
-          <w:sz w:val="17"/>
-        </w:rPr>
-        <w:t>graph TB</w:t>
-        <w:br/>
-        <w:t xml:space="preserve">    subgraph Users</w:t>
-        <w:br/>
-        <w:t xml:space="preserve">        U1["Enterprise Architect"]</w:t>
-        <w:br/>
-        <w:t xml:space="preserve">        U2["L&amp;D / Capability Lead"]</w:t>
-        <w:br/>
-        <w:t xml:space="preserve">        U3["Engineering Manager"]</w:t>
-        <w:br/>
-        <w:t xml:space="preserve">        U4["Leadership Reviewer"]</w:t>
-        <w:br/>
-        <w:t xml:space="preserve">    end</w:t>
-        <w:br/>
-        <w:br/>
-        <w:t xml:space="preserve">    AHS["&lt;b&gt;Agentic Hyper Scalers&lt;/b&gt;&lt;br/&gt;The AI Cloud Command Centre&lt;br/&gt;(Next.js portal)"]</w:t>
-        <w:br/>
-        <w:br/>
-        <w:t xml:space="preserve">    subgraph External["External systems"]</w:t>
-        <w:br/>
-        <w:t xml:space="preserve">        PX["Pexels&lt;br/&gt;(image CDN)"]</w:t>
-        <w:br/>
-        <w:t xml:space="preserve">        OFF["Official provider pages&lt;br/&gt;Microsoft Learn · Google Cloud&lt;br/&gt;AWS · Anthropic · Coursera · etc."]</w:t>
-        <w:br/>
-        <w:t xml:space="preserve">        GF["Google Fonts&lt;br/&gt;(build-time)"]</w:t>
-        <w:br/>
-        <w:t xml:space="preserve">    end</w:t>
-        <w:br/>
-        <w:br/>
-        <w:t xml:space="preserve">    U1 &amp; U2 &amp; U3 &amp; U4 --&gt;|"HTTPS (browser)"| AHS</w:t>
-        <w:br/>
-        <w:t xml:space="preserve">    AHS --&gt;|"optimised images"| PX</w:t>
-        <w:br/>
-        <w:t xml:space="preserve">    AHS --&gt;|"outbound deep links (new tab)"| OFF</w:t>
-        <w:br/>
-        <w:t xml:space="preserve">    AHS -.-&gt;|"fetched at build only"| GF</w:t>
+        <w:drawing>
+          <wp:inline xmlns:a="http://schemas.openxmlformats.org/drawingml/2006/main" xmlns:pic="http://schemas.openxmlformats.org/drawingml/2006/picture">
+            <wp:extent cx="5760719" cy="3302527"/>
+            <wp:docPr id="1" name="Picture 1"/>
+            <wp:cNvGraphicFramePr>
+              <a:graphicFrameLocks noChangeAspect="1"/>
+            </wp:cNvGraphicFramePr>
+            <a:graphic>
+              <a:graphicData uri="http://schemas.openxmlformats.org/drawingml/2006/picture">
+                <pic:pic>
+                  <pic:nvPicPr>
+                    <pic:cNvPr id="0" name="design_1.png"/>
+                    <pic:cNvPicPr/>
+                  </pic:nvPicPr>
+                  <pic:blipFill>
+                    <a:blip r:embed="rId12"/>
+                    <a:stretch>
+                      <a:fillRect/>
+                    </a:stretch>
+                  </pic:blipFill>
+                  <pic:spPr>
+                    <a:xfrm>
+                      <a:off x="0" y="0"/>
+                      <a:ext cx="5760719" cy="3302527"/>
+                    </a:xfrm>
+                    <a:prstGeom prst="rect"/>
+                  </pic:spPr>
+                </pic:pic>
+              </a:graphicData>
+            </a:graphic>
+          </wp:inline>
+        </w:drawing>
       </w:r>
     </w:p>
     <w:p/>
@@ -1334,66 +1325,46 @@
           <w:color w:val="6B7685"/>
           <w:sz w:val="18"/>
         </w:rPr>
-        <w:t>Figure — architecture diagram (Mermaid source; renders graphically on GitHub):</w:t>
+        <w:t>Figure — architecture diagram:</w:t>
       </w:r>
     </w:p>
     <w:p>
       <w:pPr>
-        <w:shd w:val="clear" w:fill="F2F4F7"/>
+        <w:jc w:val="center"/>
       </w:pPr>
       <w:r>
-        <w:rPr>
-          <w:rFonts w:ascii="Consolas" w:hAnsi="Consolas"/>
-          <w:color w:val="242B33"/>
-          <w:sz w:val="17"/>
-        </w:rPr>
-        <w:t>graph LR</w:t>
-        <w:br/>
-        <w:t xml:space="preserve">    subgraph Dev["Developer workstation"]</w:t>
-        <w:br/>
-        <w:t xml:space="preserve">        SRC["Source code&lt;br/&gt;app / components / lib"]</w:t>
-        <w:br/>
-        <w:t xml:space="preserve">        DATA["Data files&lt;br/&gt;CSV + JSON"]</w:t>
-        <w:br/>
-        <w:t xml:space="preserve">    end</w:t>
-        <w:br/>
-        <w:br/>
-        <w:t xml:space="preserve">    subgraph GH["GitHub — nimragram74/agentic-hyperscalers"]</w:t>
-        <w:br/>
-        <w:t xml:space="preserve">        REPO["main branch"]</w:t>
-        <w:br/>
-        <w:t xml:space="preserve">    end</w:t>
-        <w:br/>
-        <w:br/>
-        <w:t xml:space="preserve">    subgraph Vercel["Vercel Platform"]</w:t>
-        <w:br/>
-        <w:t xml:space="preserve">        BUILD["Build pipeline&lt;br/&gt;next build (SSG)"]</w:t>
-        <w:br/>
-        <w:t xml:space="preserve">        EDGE["Global Edge / CDN&lt;br/&gt;static HTML + JS + RSC payloads"]</w:t>
-        <w:br/>
-        <w:t xml:space="preserve">    end</w:t>
-        <w:br/>
-        <w:br/>
-        <w:t xml:space="preserve">    subgraph Client["End-user browser"]</w:t>
-        <w:br/>
-        <w:t xml:space="preserve">        HTML["Pre-rendered HTML"]</w:t>
-        <w:br/>
-        <w:t xml:space="preserve">        HYD["Hydrated client components"]</w:t>
-        <w:br/>
-        <w:t xml:space="preserve">    end</w:t>
-        <w:br/>
-        <w:br/>
-        <w:t xml:space="preserve">    SRC &amp; DATA --&gt;|git push| REPO</w:t>
-        <w:br/>
-        <w:t xml:space="preserve">    REPO --&gt;|webhook trigger| BUILD</w:t>
-        <w:br/>
-        <w:t xml:space="preserve">    BUILD --&gt;|immutable deploy| EDGE</w:t>
-        <w:br/>
-        <w:t xml:space="preserve">    EDGE --&gt;|HTTPS| HTML</w:t>
-        <w:br/>
-        <w:t xml:space="preserve">    HTML --&gt; HYD</w:t>
-        <w:br/>
-        <w:t xml:space="preserve">    HYD --&gt;|images| PX["Pexels CDN"]</w:t>
+        <w:drawing>
+          <wp:inline xmlns:a="http://schemas.openxmlformats.org/drawingml/2006/main" xmlns:pic="http://schemas.openxmlformats.org/drawingml/2006/picture">
+            <wp:extent cx="5760720" cy="719782"/>
+            <wp:docPr id="2" name="Picture 2"/>
+            <wp:cNvGraphicFramePr>
+              <a:graphicFrameLocks noChangeAspect="1"/>
+            </wp:cNvGraphicFramePr>
+            <a:graphic>
+              <a:graphicData uri="http://schemas.openxmlformats.org/drawingml/2006/picture">
+                <pic:pic>
+                  <pic:nvPicPr>
+                    <pic:cNvPr id="0" name="design_2.png"/>
+                    <pic:cNvPicPr/>
+                  </pic:nvPicPr>
+                  <pic:blipFill>
+                    <a:blip r:embed="rId13"/>
+                    <a:stretch>
+                      <a:fillRect/>
+                    </a:stretch>
+                  </pic:blipFill>
+                  <pic:spPr>
+                    <a:xfrm>
+                      <a:off x="0" y="0"/>
+                      <a:ext cx="5760720" cy="719782"/>
+                    </a:xfrm>
+                    <a:prstGeom prst="rect"/>
+                  </pic:spPr>
+                </pic:pic>
+              </a:graphicData>
+            </a:graphic>
+          </wp:inline>
+        </w:drawing>
       </w:r>
     </w:p>
     <w:p/>
@@ -1450,130 +1421,46 @@
           <w:color w:val="6B7685"/>
           <w:sz w:val="18"/>
         </w:rPr>
-        <w:t>Figure — architecture diagram (Mermaid source; renders graphically on GitHub):</w:t>
+        <w:t>Figure — architecture diagram:</w:t>
       </w:r>
     </w:p>
     <w:p>
       <w:pPr>
-        <w:shd w:val="clear" w:fill="F2F4F7"/>
+        <w:jc w:val="center"/>
       </w:pPr>
       <w:r>
-        <w:rPr>
-          <w:rFonts w:ascii="Consolas" w:hAnsi="Consolas"/>
-          <w:color w:val="242B33"/>
-          <w:sz w:val="17"/>
-        </w:rPr>
-        <w:t>graph TD</w:t>
-        <w:br/>
-        <w:t xml:space="preserve">    subgraph AppRouter["app/ — routes (Server Components)"]</w:t>
-        <w:br/>
-        <w:t xml:space="preserve">        L["layout.tsx&lt;br/&gt;(fonts, Navbar, Footer, PageTransition)"]</w:t>
-        <w:br/>
-        <w:t xml:space="preserve">        H["page.tsx — /"]</w:t>
-        <w:br/>
-        <w:t xml:space="preserve">        HY["hyperscalers/page.tsx"]</w:t>
-        <w:br/>
-        <w:t xml:space="preserve">        CE["certifications/page.tsx"]</w:t>
-        <w:br/>
-        <w:t xml:space="preserve">        TR["training/page.tsx"]</w:t>
-        <w:br/>
-        <w:t xml:space="preserve">        NW["news/page.tsx"]</w:t>
-        <w:br/>
-        <w:t xml:space="preserve">        CP["compare/page.tsx"]</w:t>
-        <w:br/>
-        <w:t xml:space="preserve">    end</w:t>
-        <w:br/>
-        <w:br/>
-        <w:t xml:space="preserve">    subgraph Lib["lib/ — data &amp; domain (server-safe / pure)"]</w:t>
-        <w:br/>
-        <w:t xml:space="preserve">        D["data.ts&lt;br/&gt;(fs read + CSV/JSON parse)"]</w:t>
-        <w:br/>
-        <w:t xml:space="preserve">        T["types.ts&lt;br/&gt;(domain contracts)"]</w:t>
-        <w:br/>
-        <w:t xml:space="preserve">        B["brand.ts&lt;br/&gt;(colours, providerToId, helpers)"]</w:t>
-        <w:br/>
-        <w:t xml:space="preserve">    end</w:t>
-        <w:br/>
-        <w:br/>
-        <w:t xml:space="preserve">    subgraph DataFiles["data/"]</w:t>
-        <w:br/>
-        <w:t xml:space="preserve">        C1["certifications.csv"]</w:t>
-        <w:br/>
-        <w:t xml:space="preserve">        C2["training.csv"]</w:t>
-        <w:br/>
-        <w:t xml:space="preserve">        C3["hyperscalers.json"]</w:t>
-        <w:br/>
-        <w:t xml:space="preserve">        C4["news.json"]</w:t>
-        <w:br/>
-        <w:t xml:space="preserve">    end</w:t>
-        <w:br/>
-        <w:br/>
-        <w:t xml:space="preserve">    subgraph Client["components/ — Client Components ('use client')"]</w:t>
-        <w:br/>
-        <w:t xml:space="preserve">        NAV["Navbar"]</w:t>
-        <w:br/>
-        <w:t xml:space="preserve">        FOOT["Footer"]</w:t>
-        <w:br/>
-        <w:t xml:space="preserve">        PT["PageTransition"]</w:t>
-        <w:br/>
-        <w:t xml:space="preserve">        AG["AmbientGlow"]</w:t>
-        <w:br/>
-        <w:t xml:space="preserve">        CD["CommandDeck"]</w:t>
-        <w:br/>
-        <w:t xml:space="preserve">        CU["CountUp"]</w:t>
-        <w:br/>
-        <w:t xml:space="preserve">        RV["Reveal"]</w:t>
-        <w:br/>
-        <w:t xml:space="preserve">        HC["HyperscalerCard"]</w:t>
-        <w:br/>
-        <w:t xml:space="preserve">        HT["HyperscalerTabs"]</w:t>
-        <w:br/>
-        <w:t xml:space="preserve">        CX["CertExplorer"]</w:t>
-        <w:br/>
-        <w:t xml:space="preserve">        TX["TrainingExplorer"]</w:t>
-        <w:br/>
-        <w:t xml:space="preserve">        NX["NewsExplorer"]</w:t>
-        <w:br/>
-        <w:t xml:space="preserve">        CT["CompareTable"]</w:t>
-        <w:br/>
-        <w:t xml:space="preserve">    end</w:t>
-        <w:br/>
-        <w:br/>
-        <w:t xml:space="preserve">    subgraph Shared["components/ — presentational"]</w:t>
-        <w:br/>
-        <w:t xml:space="preserve">        SH["SectionHeading"]</w:t>
-        <w:br/>
-        <w:t xml:space="preserve">        NC["NewsCard"]</w:t>
-        <w:br/>
-        <w:t xml:space="preserve">        CC["CertCard"]</w:t>
-        <w:br/>
-        <w:t xml:space="preserve">    end</w:t>
-        <w:br/>
-        <w:br/>
-        <w:t xml:space="preserve">    D --&gt; T</w:t>
-        <w:br/>
-        <w:t xml:space="preserve">    D --&gt; B</w:t>
-        <w:br/>
-        <w:t xml:space="preserve">    D --&gt; C1 &amp; C2 &amp; C3 &amp; C4</w:t>
-        <w:br/>
-        <w:br/>
-        <w:t xml:space="preserve">    L --&gt; NAV &amp; FOOT &amp; PT</w:t>
-        <w:br/>
-        <w:t xml:space="preserve">    H --&gt; D</w:t>
-        <w:br/>
-        <w:t xml:space="preserve">    H --&gt; AG &amp; CD &amp; CU &amp; RV &amp; HC &amp; NC &amp; CC &amp; SH</w:t>
-        <w:br/>
-        <w:t xml:space="preserve">    HY --&gt; D --&gt; HT</w:t>
-        <w:br/>
-        <w:t xml:space="preserve">    CE --&gt; D --&gt; CX --&gt; CC</w:t>
-        <w:br/>
-        <w:t xml:space="preserve">    TR --&gt; D --&gt; TX</w:t>
-        <w:br/>
-        <w:t xml:space="preserve">    NW --&gt; D --&gt; NX --&gt; NC</w:t>
-        <w:br/>
-        <w:t xml:space="preserve">    CP --&gt; D --&gt; CT</w:t>
-        <w:br/>
-        <w:t xml:space="preserve">    B --&gt; Client &amp; Shared</w:t>
+        <w:drawing>
+          <wp:inline xmlns:a="http://schemas.openxmlformats.org/drawingml/2006/main" xmlns:pic="http://schemas.openxmlformats.org/drawingml/2006/picture">
+            <wp:extent cx="5760720" cy="1029054"/>
+            <wp:docPr id="3" name="Picture 3"/>
+            <wp:cNvGraphicFramePr>
+              <a:graphicFrameLocks noChangeAspect="1"/>
+            </wp:cNvGraphicFramePr>
+            <a:graphic>
+              <a:graphicData uri="http://schemas.openxmlformats.org/drawingml/2006/picture">
+                <pic:pic>
+                  <pic:nvPicPr>
+                    <pic:cNvPr id="0" name="design_3.png"/>
+                    <pic:cNvPicPr/>
+                  </pic:nvPicPr>
+                  <pic:blipFill>
+                    <a:blip r:embed="rId14"/>
+                    <a:stretch>
+                      <a:fillRect/>
+                    </a:stretch>
+                  </pic:blipFill>
+                  <pic:spPr>
+                    <a:xfrm>
+                      <a:off x="0" y="0"/>
+                      <a:ext cx="5760720" cy="1029054"/>
+                    </a:xfrm>
+                    <a:prstGeom prst="rect"/>
+                  </pic:spPr>
+                </pic:pic>
+              </a:graphicData>
+            </a:graphic>
+          </wp:inline>
+        </w:drawing>
       </w:r>
     </w:p>
     <w:p/>
@@ -1592,44 +1479,46 @@
           <w:color w:val="6B7685"/>
           <w:sz w:val="18"/>
         </w:rPr>
-        <w:t>Figure — architecture diagram (Mermaid source; renders graphically on GitHub):</w:t>
+        <w:t>Figure — architecture diagram:</w:t>
       </w:r>
     </w:p>
     <w:p>
       <w:pPr>
-        <w:shd w:val="clear" w:fill="F2F4F7"/>
+        <w:jc w:val="center"/>
       </w:pPr>
       <w:r>
-        <w:rPr>
-          <w:rFonts w:ascii="Consolas" w:hAnsi="Consolas"/>
-          <w:color w:val="242B33"/>
-          <w:sz w:val="17"/>
-        </w:rPr>
-        <w:t>flowchart LR</w:t>
-        <w:br/>
-        <w:t xml:space="preserve">    subgraph ServerSide["Server / build-time"]</w:t>
-        <w:br/>
-        <w:t xml:space="preserve">        direction TB</w:t>
-        <w:br/>
-        <w:t xml:space="preserve">        FS["data/*.csv|json"] --&gt; P["lib/data.ts parser"]</w:t>
-        <w:br/>
-        <w:t xml:space="preserve">        P --&gt; RSC["Route Server Components&lt;br/&gt;(fetch + shape data)"]</w:t>
-        <w:br/>
-        <w:t xml:space="preserve">    end</w:t>
-        <w:br/>
-        <w:t xml:space="preserve">    subgraph ClientSide["Browser / runtime"]</w:t>
-        <w:br/>
-        <w:t xml:space="preserve">        direction TB</w:t>
-        <w:br/>
-        <w:t xml:space="preserve">        IC["Interactive components&lt;br/&gt;filters, tabs, animations"]</w:t>
-        <w:br/>
-        <w:t xml:space="preserve">    end</w:t>
-        <w:br/>
-        <w:t xml:space="preserve">    RSC --&gt;|"typed props (serialised)"| IC</w:t>
-        <w:br/>
-        <w:t xml:space="preserve">    style ServerSide fill:#0d1117,stroke:#00D4FF,color:#E6EDF3</w:t>
-        <w:br/>
-        <w:t xml:space="preserve">    style ClientSide fill:#0d1117,stroke:#FF9900,color:#E6EDF3</w:t>
+        <w:drawing>
+          <wp:inline xmlns:a="http://schemas.openxmlformats.org/drawingml/2006/main" xmlns:pic="http://schemas.openxmlformats.org/drawingml/2006/picture">
+            <wp:extent cx="5760720" cy="740987"/>
+            <wp:docPr id="4" name="Picture 4"/>
+            <wp:cNvGraphicFramePr>
+              <a:graphicFrameLocks noChangeAspect="1"/>
+            </wp:cNvGraphicFramePr>
+            <a:graphic>
+              <a:graphicData uri="http://schemas.openxmlformats.org/drawingml/2006/picture">
+                <pic:pic>
+                  <pic:nvPicPr>
+                    <pic:cNvPr id="0" name="design_4.png"/>
+                    <pic:cNvPicPr/>
+                  </pic:nvPicPr>
+                  <pic:blipFill>
+                    <a:blip r:embed="rId15"/>
+                    <a:stretch>
+                      <a:fillRect/>
+                    </a:stretch>
+                  </pic:blipFill>
+                  <pic:spPr>
+                    <a:xfrm>
+                      <a:off x="0" y="0"/>
+                      <a:ext cx="5760720" cy="740987"/>
+                    </a:xfrm>
+                    <a:prstGeom prst="rect"/>
+                  </pic:spPr>
+                </pic:pic>
+              </a:graphicData>
+            </a:graphic>
+          </wp:inline>
+        </w:drawing>
       </w:r>
     </w:p>
     <w:p/>
@@ -1755,30 +1644,46 @@
           <w:color w:val="6B7685"/>
           <w:sz w:val="18"/>
         </w:rPr>
-        <w:t>Figure — architecture diagram (Mermaid source; renders graphically on GitHub):</w:t>
+        <w:t>Figure — architecture diagram:</w:t>
       </w:r>
     </w:p>
     <w:p>
       <w:pPr>
-        <w:shd w:val="clear" w:fill="F2F4F7"/>
+        <w:jc w:val="center"/>
       </w:pPr>
       <w:r>
-        <w:rPr>
-          <w:rFonts w:ascii="Consolas" w:hAnsi="Consolas"/>
-          <w:color w:val="242B33"/>
-          <w:sz w:val="17"/>
-        </w:rPr>
-        <w:t>graph LR</w:t>
-        <w:br/>
-        <w:t xml:space="preserve">    ROOT["/"] --- HY["/hyperscalers&lt;br/&gt;?tab=microsoft|google|aws|anthropic"]</w:t>
-        <w:br/>
-        <w:t xml:space="preserve">    ROOT --- CE["/certifications"]</w:t>
-        <w:br/>
-        <w:t xml:space="preserve">    ROOT --- TR["/training"]</w:t>
-        <w:br/>
-        <w:t xml:space="preserve">    ROOT --- NW["/news"]</w:t>
-        <w:br/>
-        <w:t xml:space="preserve">    ROOT --- CP["/compare"]</w:t>
+        <w:drawing>
+          <wp:inline xmlns:a="http://schemas.openxmlformats.org/drawingml/2006/main" xmlns:pic="http://schemas.openxmlformats.org/drawingml/2006/picture">
+            <wp:extent cx="4381500" cy="5086350"/>
+            <wp:docPr id="5" name="Picture 5"/>
+            <wp:cNvGraphicFramePr>
+              <a:graphicFrameLocks noChangeAspect="1"/>
+            </wp:cNvGraphicFramePr>
+            <a:graphic>
+              <a:graphicData uri="http://schemas.openxmlformats.org/drawingml/2006/picture">
+                <pic:pic>
+                  <pic:nvPicPr>
+                    <pic:cNvPr id="0" name="design_5.png"/>
+                    <pic:cNvPicPr/>
+                  </pic:nvPicPr>
+                  <pic:blipFill>
+                    <a:blip r:embed="rId16"/>
+                    <a:stretch>
+                      <a:fillRect/>
+                    </a:stretch>
+                  </pic:blipFill>
+                  <pic:spPr>
+                    <a:xfrm>
+                      <a:off x="0" y="0"/>
+                      <a:ext cx="4381500" cy="5086350"/>
+                    </a:xfrm>
+                    <a:prstGeom prst="rect"/>
+                  </pic:spPr>
+                </pic:pic>
+              </a:graphicData>
+            </a:graphic>
+          </wp:inline>
+        </w:drawing>
       </w:r>
     </w:p>
     <w:p/>
@@ -2359,125 +2264,46 @@
           <w:color w:val="6B7685"/>
           <w:sz w:val="18"/>
         </w:rPr>
-        <w:t>Figure — architecture diagram (Mermaid source; renders graphically on GitHub):</w:t>
+        <w:t>Figure — architecture diagram:</w:t>
       </w:r>
     </w:p>
     <w:p>
       <w:pPr>
-        <w:shd w:val="clear" w:fill="F2F4F7"/>
+        <w:jc w:val="center"/>
       </w:pPr>
       <w:r>
-        <w:rPr>
-          <w:rFonts w:ascii="Consolas" w:hAnsi="Consolas"/>
-          <w:color w:val="242B33"/>
-          <w:sz w:val="17"/>
-        </w:rPr>
-        <w:t>erDiagram</w:t>
-        <w:br/>
-        <w:t xml:space="preserve">    HYPERSCALER ||--o{ CERTIFICATION : "offers (by provider)"</w:t>
-        <w:br/>
-        <w:t xml:space="preserve">    HYPERSCALER ||--o{ TRAINING : "offers (by provider)"</w:t>
-        <w:br/>
-        <w:t xml:space="preserve">    HYPERSCALER ||--o{ NEWS : "publishes (by provider)"</w:t>
-        <w:br/>
-        <w:br/>
-        <w:t xml:space="preserve">    HYPERSCALER {</w:t>
-        <w:br/>
-        <w:t xml:space="preserve">        string id PK</w:t>
-        <w:br/>
-        <w:t xml:space="preserve">        string name</w:t>
-        <w:br/>
-        <w:t xml:space="preserve">        string tagline</w:t>
-        <w:br/>
-        <w:t xml:space="preserve">        string color</w:t>
-        <w:br/>
-        <w:t xml:space="preserve">        int founded_ai_year</w:t>
-        <w:br/>
-        <w:t xml:space="preserve">        string[] key_products</w:t>
-        <w:br/>
-        <w:t xml:space="preserve">        string[] strengths</w:t>
-        <w:br/>
-        <w:t xml:space="preserve">        string market_position</w:t>
-        <w:br/>
-        <w:t xml:space="preserve">        string[] notable_models</w:t>
-        <w:br/>
-        <w:t xml:space="preserve">        string employee_count</w:t>
-        <w:br/>
-        <w:t xml:space="preserve">        string pricing_tier</w:t>
-        <w:br/>
-        <w:t xml:space="preserve">        string best_for</w:t>
-        <w:br/>
-        <w:t xml:space="preserve">        bool free_training</w:t>
-        <w:br/>
-        <w:t xml:space="preserve">        string image</w:t>
-        <w:br/>
-        <w:t xml:space="preserve">    }</w:t>
-        <w:br/>
-        <w:t xml:space="preserve">    CERTIFICATION {</w:t>
-        <w:br/>
-        <w:t xml:space="preserve">        string provider FK</w:t>
-        <w:br/>
-        <w:t xml:space="preserve">        string name</w:t>
-        <w:br/>
-        <w:t xml:space="preserve">        string code</w:t>
-        <w:br/>
-        <w:t xml:space="preserve">        string level</w:t>
-        <w:br/>
-        <w:t xml:space="preserve">        string domain</w:t>
-        <w:br/>
-        <w:t xml:space="preserve">        number cost_usd</w:t>
-        <w:br/>
-        <w:t xml:space="preserve">        number validity_years</w:t>
-        <w:br/>
-        <w:t xml:space="preserve">        string exam_format</w:t>
-        <w:br/>
-        <w:t xml:space="preserve">        bool popular</w:t>
-        <w:br/>
-        <w:t xml:space="preserve">        string url</w:t>
-        <w:br/>
-        <w:t xml:space="preserve">    }</w:t>
-        <w:br/>
-        <w:t xml:space="preserve">    TRAINING {</w:t>
-        <w:br/>
-        <w:t xml:space="preserve">        string provider FK</w:t>
-        <w:br/>
-        <w:t xml:space="preserve">        string course_name</w:t>
-        <w:br/>
-        <w:t xml:space="preserve">        string platform</w:t>
-        <w:br/>
-        <w:t xml:space="preserve">        string level</w:t>
-        <w:br/>
-        <w:t xml:space="preserve">        number duration_hours</w:t>
-        <w:br/>
-        <w:t xml:space="preserve">        enum cost</w:t>
-        <w:br/>
-        <w:t xml:space="preserve">        string url</w:t>
-        <w:br/>
-        <w:t xml:space="preserve">        number rating</w:t>
-        <w:br/>
-        <w:t xml:space="preserve">        string[] tags</w:t>
-        <w:br/>
-        <w:t xml:space="preserve">    }</w:t>
-        <w:br/>
-        <w:t xml:space="preserve">    NEWS {</w:t>
-        <w:br/>
-        <w:t xml:space="preserve">        string id PK</w:t>
-        <w:br/>
-        <w:t xml:space="preserve">        string provider FK</w:t>
-        <w:br/>
-        <w:t xml:space="preserve">        string headline</w:t>
-        <w:br/>
-        <w:t xml:space="preserve">        string summary</w:t>
-        <w:br/>
-        <w:t xml:space="preserve">        string category</w:t>
-        <w:br/>
-        <w:t xml:space="preserve">        date date</w:t>
-        <w:br/>
-        <w:t xml:space="preserve">        bool isBreaking</w:t>
-        <w:br/>
-        <w:t xml:space="preserve">        string[] tags</w:t>
-        <w:br/>
-        <w:t xml:space="preserve">    }</w:t>
+        <w:drawing>
+          <wp:inline xmlns:a="http://schemas.openxmlformats.org/drawingml/2006/main" xmlns:pic="http://schemas.openxmlformats.org/drawingml/2006/picture">
+            <wp:extent cx="5760720" cy="6900511"/>
+            <wp:docPr id="6" name="Picture 6"/>
+            <wp:cNvGraphicFramePr>
+              <a:graphicFrameLocks noChangeAspect="1"/>
+            </wp:cNvGraphicFramePr>
+            <a:graphic>
+              <a:graphicData uri="http://schemas.openxmlformats.org/drawingml/2006/picture">
+                <pic:pic>
+                  <pic:nvPicPr>
+                    <pic:cNvPr id="0" name="design_6.png"/>
+                    <pic:cNvPicPr/>
+                  </pic:nvPicPr>
+                  <pic:blipFill>
+                    <a:blip r:embed="rId17"/>
+                    <a:stretch>
+                      <a:fillRect/>
+                    </a:stretch>
+                  </pic:blipFill>
+                  <pic:spPr>
+                    <a:xfrm>
+                      <a:off x="0" y="0"/>
+                      <a:ext cx="5760720" cy="6900511"/>
+                    </a:xfrm>
+                    <a:prstGeom prst="rect"/>
+                  </pic:spPr>
+                </pic:pic>
+              </a:graphicData>
+            </a:graphic>
+          </wp:inline>
+        </w:drawing>
       </w:r>
     </w:p>
     <w:p/>
@@ -2586,38 +2412,46 @@
           <w:color w:val="6B7685"/>
           <w:sz w:val="18"/>
         </w:rPr>
-        <w:t>Figure — architecture diagram (Mermaid source; renders graphically on GitHub):</w:t>
+        <w:t>Figure — architecture diagram:</w:t>
       </w:r>
     </w:p>
     <w:p>
       <w:pPr>
-        <w:shd w:val="clear" w:fill="F2F4F7"/>
+        <w:jc w:val="center"/>
       </w:pPr>
       <w:r>
-        <w:rPr>
-          <w:rFonts w:ascii="Consolas" w:hAnsi="Consolas"/>
-          <w:color w:val="242B33"/>
-          <w:sz w:val="17"/>
-        </w:rPr>
-        <w:t>sequenceDiagram</w:t>
-        <w:br/>
-        <w:t xml:space="preserve">    participant U as Browser</w:t>
-        <w:br/>
-        <w:t xml:space="preserve">    participant E as Vercel Edge/CDN</w:t>
-        <w:br/>
-        <w:t xml:space="preserve">    participant H as Pre-rendered HTML/JS</w:t>
-        <w:br/>
-        <w:t xml:space="preserve">    U-&gt;&gt;E: GET /certifications</w:t>
-        <w:br/>
-        <w:t xml:space="preserve">    E--&gt;&gt;U: Static HTML (pre-rendered at build) + RSC payload</w:t>
-        <w:br/>
-        <w:t xml:space="preserve">    U-&gt;&gt;U: Hydrate CertExplorer (client component)</w:t>
-        <w:br/>
-        <w:t xml:space="preserve">    U-&gt;&gt;E: Lazy-load JS chunks + Pexels images</w:t>
-        <w:br/>
-        <w:t xml:space="preserve">    E--&gt;&gt;U: Assets (cached at edge)</w:t>
-        <w:br/>
-        <w:t xml:space="preserve">    Note over U: Fully interactive — filtering is 100% client-side</w:t>
+        <w:drawing>
+          <wp:inline xmlns:a="http://schemas.openxmlformats.org/drawingml/2006/main" xmlns:pic="http://schemas.openxmlformats.org/drawingml/2006/picture">
+            <wp:extent cx="5760720" cy="2767405"/>
+            <wp:docPr id="7" name="Picture 7"/>
+            <wp:cNvGraphicFramePr>
+              <a:graphicFrameLocks noChangeAspect="1"/>
+            </wp:cNvGraphicFramePr>
+            <a:graphic>
+              <a:graphicData uri="http://schemas.openxmlformats.org/drawingml/2006/picture">
+                <pic:pic>
+                  <pic:nvPicPr>
+                    <pic:cNvPr id="0" name="design_7.png"/>
+                    <pic:cNvPicPr/>
+                  </pic:nvPicPr>
+                  <pic:blipFill>
+                    <a:blip r:embed="rId18"/>
+                    <a:stretch>
+                      <a:fillRect/>
+                    </a:stretch>
+                  </pic:blipFill>
+                  <pic:spPr>
+                    <a:xfrm>
+                      <a:off x="0" y="0"/>
+                      <a:ext cx="5760720" cy="2767405"/>
+                    </a:xfrm>
+                    <a:prstGeom prst="rect"/>
+                  </pic:spPr>
+                </pic:pic>
+              </a:graphicData>
+            </a:graphic>
+          </wp:inline>
+        </w:drawing>
       </w:r>
     </w:p>
     <w:p/>
@@ -2636,40 +2470,46 @@
           <w:color w:val="6B7685"/>
           <w:sz w:val="18"/>
         </w:rPr>
-        <w:t>Figure — architecture diagram (Mermaid source; renders graphically on GitHub):</w:t>
+        <w:t>Figure — architecture diagram:</w:t>
       </w:r>
     </w:p>
     <w:p>
       <w:pPr>
-        <w:shd w:val="clear" w:fill="F2F4F7"/>
+        <w:jc w:val="center"/>
       </w:pPr>
       <w:r>
-        <w:rPr>
-          <w:rFonts w:ascii="Consolas" w:hAnsi="Consolas"/>
-          <w:color w:val="242B33"/>
-          <w:sz w:val="17"/>
-        </w:rPr>
-        <w:t>sequenceDiagram</w:t>
-        <w:br/>
-        <w:t xml:space="preserve">    participant CI as Vercel Build</w:t>
-        <w:br/>
-        <w:t xml:space="preserve">    participant N as next build</w:t>
-        <w:br/>
-        <w:t xml:space="preserve">    participant FS as data/*.csv|json</w:t>
-        <w:br/>
-        <w:t xml:space="preserve">    participant R as Route Server Components</w:t>
-        <w:br/>
-        <w:t xml:space="preserve">    CI-&gt;&gt;N: install + build</w:t>
-        <w:br/>
-        <w:t xml:space="preserve">    N-&gt;&gt;R: render each route</w:t>
-        <w:br/>
-        <w:t xml:space="preserve">    R-&gt;&gt;FS: getCertifications() / getNews() ...</w:t>
-        <w:br/>
-        <w:t xml:space="preserve">    FS--&gt;&gt;R: parsed, typed objects</w:t>
-        <w:br/>
-        <w:t xml:space="preserve">    R--&gt;&gt;N: static HTML per route</w:t>
-        <w:br/>
-        <w:t xml:space="preserve">    N--&gt;&gt;CI: immutable static deploy</w:t>
+        <w:drawing>
+          <wp:inline xmlns:a="http://schemas.openxmlformats.org/drawingml/2006/main" xmlns:pic="http://schemas.openxmlformats.org/drawingml/2006/picture">
+            <wp:extent cx="5760719" cy="2572150"/>
+            <wp:docPr id="8" name="Picture 8"/>
+            <wp:cNvGraphicFramePr>
+              <a:graphicFrameLocks noChangeAspect="1"/>
+            </wp:cNvGraphicFramePr>
+            <a:graphic>
+              <a:graphicData uri="http://schemas.openxmlformats.org/drawingml/2006/picture">
+                <pic:pic>
+                  <pic:nvPicPr>
+                    <pic:cNvPr id="0" name="design_8.png"/>
+                    <pic:cNvPicPr/>
+                  </pic:nvPicPr>
+                  <pic:blipFill>
+                    <a:blip r:embed="rId19"/>
+                    <a:stretch>
+                      <a:fillRect/>
+                    </a:stretch>
+                  </pic:blipFill>
+                  <pic:spPr>
+                    <a:xfrm>
+                      <a:off x="0" y="0"/>
+                      <a:ext cx="5760719" cy="2572150"/>
+                    </a:xfrm>
+                    <a:prstGeom prst="rect"/>
+                  </pic:spPr>
+                </pic:pic>
+              </a:graphicData>
+            </a:graphic>
+          </wp:inline>
+        </w:drawing>
       </w:r>
     </w:p>
     <w:p/>
@@ -2688,38 +2528,46 @@
           <w:color w:val="6B7685"/>
           <w:sz w:val="18"/>
         </w:rPr>
-        <w:t>Figure — architecture diagram (Mermaid source; renders graphically on GitHub):</w:t>
+        <w:t>Figure — architecture diagram:</w:t>
       </w:r>
     </w:p>
     <w:p>
       <w:pPr>
-        <w:shd w:val="clear" w:fill="F2F4F7"/>
+        <w:jc w:val="center"/>
       </w:pPr>
       <w:r>
-        <w:rPr>
-          <w:rFonts w:ascii="Consolas" w:hAnsi="Consolas"/>
-          <w:color w:val="242B33"/>
-          <w:sz w:val="17"/>
-        </w:rPr>
-        <w:t>sequenceDiagram</w:t>
-        <w:br/>
-        <w:t xml:space="preserve">    participant U as User</w:t>
-        <w:br/>
-        <w:t xml:space="preserve">    participant X as CertExplorer (state)</w:t>
-        <w:br/>
-        <w:t xml:space="preserve">    participant G as Card grid</w:t>
-        <w:br/>
-        <w:t xml:space="preserve">    U-&gt;&gt;X: click "AWS" + "Associate"</w:t>
-        <w:br/>
-        <w:t xml:space="preserve">    X-&gt;&gt;X: setProvider / setLevel (React state)</w:t>
-        <w:br/>
-        <w:t xml:space="preserve">    X-&gt;&gt;X: derive filtered list (AND)</w:t>
-        <w:br/>
-        <w:t xml:space="preserve">    X--&gt;&gt;G: re-render matching CertCards + count</w:t>
-        <w:br/>
-        <w:t xml:space="preserve">    U-&gt;&gt;X: click a card</w:t>
-        <w:br/>
-        <w:t xml:space="preserve">    X--&gt;&gt;U: open official URL in new tab</w:t>
+        <w:drawing>
+          <wp:inline xmlns:a="http://schemas.openxmlformats.org/drawingml/2006/main" xmlns:pic="http://schemas.openxmlformats.org/drawingml/2006/picture">
+            <wp:extent cx="5760720" cy="3456432"/>
+            <wp:docPr id="9" name="Picture 9"/>
+            <wp:cNvGraphicFramePr>
+              <a:graphicFrameLocks noChangeAspect="1"/>
+            </wp:cNvGraphicFramePr>
+            <a:graphic>
+              <a:graphicData uri="http://schemas.openxmlformats.org/drawingml/2006/picture">
+                <pic:pic>
+                  <pic:nvPicPr>
+                    <pic:cNvPr id="0" name="design_9.png"/>
+                    <pic:cNvPicPr/>
+                  </pic:nvPicPr>
+                  <pic:blipFill>
+                    <a:blip r:embed="rId20"/>
+                    <a:stretch>
+                      <a:fillRect/>
+                    </a:stretch>
+                  </pic:blipFill>
+                  <pic:spPr>
+                    <a:xfrm>
+                      <a:off x="0" y="0"/>
+                      <a:ext cx="5760720" cy="3456432"/>
+                    </a:xfrm>
+                    <a:prstGeom prst="rect"/>
+                  </pic:spPr>
+                </pic:pic>
+              </a:graphicData>
+            </a:graphic>
+          </wp:inline>
+        </w:drawing>
       </w:r>
     </w:p>
     <w:p/>
@@ -4481,58 +4329,46 @@
           <w:color w:val="6B7685"/>
           <w:sz w:val="18"/>
         </w:rPr>
-        <w:t>Figure — architecture diagram (Mermaid source; renders graphically on GitHub):</w:t>
+        <w:t>Figure — architecture diagram:</w:t>
       </w:r>
     </w:p>
     <w:p>
       <w:pPr>
-        <w:shd w:val="clear" w:fill="F2F4F7"/>
+        <w:jc w:val="center"/>
       </w:pPr>
       <w:r>
-        <w:rPr>
-          <w:rFonts w:ascii="Consolas" w:hAnsi="Consolas"/>
-          <w:color w:val="242B33"/>
-          <w:sz w:val="17"/>
-        </w:rPr>
-        <w:t>graph LR</w:t>
-        <w:br/>
-        <w:t xml:space="preserve">    subgraph Tokens["Design tokens (tailwind.config.ts + brand.ts)"]</w:t>
-        <w:br/>
-        <w:t xml:space="preserve">        S["Surfaces&lt;br/&gt;#0D1117 / #161B22 / #1C2333"]</w:t>
-        <w:br/>
-        <w:t xml:space="preserve">        A["Accent&lt;br/&gt;#00D4FF"]</w:t>
-        <w:br/>
-        <w:t xml:space="preserve">        BR["Brand&lt;br/&gt;MS #00BCF2 · G #4285F4&lt;br/&gt;AWS #FF9900 · Anthropic #C4622D"]</w:t>
-        <w:br/>
-        <w:t xml:space="preserve">        TY["Type&lt;br/&gt;Space Grotesk / Inter"]</w:t>
-        <w:br/>
-        <w:t xml:space="preserve">        FX["Effects&lt;br/&gt;glass · grid-texture · glow · keyframes"]</w:t>
-        <w:br/>
-        <w:t xml:space="preserve">    end</w:t>
-        <w:br/>
-        <w:t xml:space="preserve">    subgraph Primitives["Reusable utilities (globals.css)"]</w:t>
-        <w:br/>
-        <w:t xml:space="preserve">        GL[".glass"]</w:t>
-        <w:br/>
-        <w:t xml:space="preserve">        GT[".grid-texture"]</w:t>
-        <w:br/>
-        <w:t xml:space="preserve">        GR[".glow-radial"]</w:t>
-        <w:br/>
-        <w:t xml:space="preserve">        PB[".pill-btn"]</w:t>
-        <w:br/>
-        <w:t xml:space="preserve">        EB[".eyebrow"]</w:t>
-        <w:br/>
-        <w:t xml:space="preserve">    end</w:t>
-        <w:br/>
-        <w:t xml:space="preserve">    subgraph Components["UI components"]</w:t>
-        <w:br/>
-        <w:t xml:space="preserve">        ALL["All cards, tiles, tabs,&lt;br/&gt;tables, hero, nav"]</w:t>
-        <w:br/>
-        <w:t xml:space="preserve">    end</w:t>
-        <w:br/>
-        <w:t xml:space="preserve">    Tokens --&gt; Primitives --&gt; Components</w:t>
-        <w:br/>
-        <w:t xml:space="preserve">    GuardRail["design-enforcer agent&lt;br/&gt;audits &amp; fixes drift"] -.enforces.-&gt; Components</w:t>
+        <w:drawing>
+          <wp:inline xmlns:a="http://schemas.openxmlformats.org/drawingml/2006/main" xmlns:pic="http://schemas.openxmlformats.org/drawingml/2006/picture">
+            <wp:extent cx="5760720" cy="648711"/>
+            <wp:docPr id="10" name="Picture 10"/>
+            <wp:cNvGraphicFramePr>
+              <a:graphicFrameLocks noChangeAspect="1"/>
+            </wp:cNvGraphicFramePr>
+            <a:graphic>
+              <a:graphicData uri="http://schemas.openxmlformats.org/drawingml/2006/picture">
+                <pic:pic>
+                  <pic:nvPicPr>
+                    <pic:cNvPr id="0" name="design_10.png"/>
+                    <pic:cNvPicPr/>
+                  </pic:nvPicPr>
+                  <pic:blipFill>
+                    <a:blip r:embed="rId21"/>
+                    <a:stretch>
+                      <a:fillRect/>
+                    </a:stretch>
+                  </pic:blipFill>
+                  <pic:spPr>
+                    <a:xfrm>
+                      <a:off x="0" y="0"/>
+                      <a:ext cx="5760720" cy="648711"/>
+                    </a:xfrm>
+                    <a:prstGeom prst="rect"/>
+                  </pic:spPr>
+                </pic:pic>
+              </a:graphicData>
+            </a:graphic>
+          </wp:inline>
+        </w:drawing>
       </w:r>
     </w:p>
     <w:p/>
@@ -5377,26 +5213,46 @@
           <w:color w:val="6B7685"/>
           <w:sz w:val="18"/>
         </w:rPr>
-        <w:t>Figure — architecture diagram (Mermaid source; renders graphically on GitHub):</w:t>
+        <w:t>Figure — architecture diagram:</w:t>
       </w:r>
     </w:p>
     <w:p>
       <w:pPr>
-        <w:shd w:val="clear" w:fill="F2F4F7"/>
+        <w:jc w:val="center"/>
       </w:pPr>
       <w:r>
-        <w:rPr>
-          <w:rFonts w:ascii="Consolas" w:hAnsi="Consolas"/>
-          <w:color w:val="242B33"/>
-          <w:sz w:val="17"/>
-        </w:rPr>
-        <w:t>flowchart LR</w:t>
-        <w:br/>
-        <w:t xml:space="preserve">    DEV["Local dev&lt;br/&gt;npm run dev"] --&gt;|commit| MAIN["GitHub main"]</w:t>
-        <w:br/>
-        <w:t xml:space="preserve">    MAIN --&gt;|auto webhook| PRE["Vercel Preview&lt;br/&gt;(per push/PR)"]</w:t>
-        <w:br/>
-        <w:t xml:space="preserve">    MAIN --&gt;|production alias| PROD["Vercel Production&lt;br/&gt;agentic-hyperscalers.vercel.app"]</w:t>
+        <w:drawing>
+          <wp:inline xmlns:a="http://schemas.openxmlformats.org/drawingml/2006/main" xmlns:pic="http://schemas.openxmlformats.org/drawingml/2006/picture">
+            <wp:extent cx="5760720" cy="1665261"/>
+            <wp:docPr id="11" name="Picture 11"/>
+            <wp:cNvGraphicFramePr>
+              <a:graphicFrameLocks noChangeAspect="1"/>
+            </wp:cNvGraphicFramePr>
+            <a:graphic>
+              <a:graphicData uri="http://schemas.openxmlformats.org/drawingml/2006/picture">
+                <pic:pic>
+                  <pic:nvPicPr>
+                    <pic:cNvPr id="0" name="design_11.png"/>
+                    <pic:cNvPicPr/>
+                  </pic:nvPicPr>
+                  <pic:blipFill>
+                    <a:blip r:embed="rId22"/>
+                    <a:stretch>
+                      <a:fillRect/>
+                    </a:stretch>
+                  </pic:blipFill>
+                  <pic:spPr>
+                    <a:xfrm>
+                      <a:off x="0" y="0"/>
+                      <a:ext cx="5760720" cy="1665261"/>
+                    </a:xfrm>
+                    <a:prstGeom prst="rect"/>
+                  </pic:spPr>
+                </pic:pic>
+              </a:graphicData>
+            </a:graphic>
+          </wp:inline>
+        </w:drawing>
       </w:r>
     </w:p>
     <w:p/>

</xml_diff>